<commit_message>
书中删除 GitHub Pages 网址
- 版权页、关于作者页（DOCX/EPUB/印刷版）、封底不再印网址；封底改为“出版：光影与信仰 · Light and Faith Press”
- book.json 移除 site 字段，作者简介不再提“见上方网址”
- EPUB 标识符改用固定命名空间
- 重新生成电子版与印刷版全部文件

Co-Authored-By: Claude Fable 5.1 <noreply@anthropic.com>
Claude-Session: https://claude.ai/code/session_01SEauPvV3GpSMdWC5Ca7Cuj
</commit_message>
<xml_diff>
--- a/book/dist/慢慢地动怒-简体.docx
+++ b/book/dist/慢慢地动怒-简体.docx
@@ -169,20 +169,6 @@
           <w:sz w:val="18"/>
         </w:rPr>
         <w:t>出版：光影与信仰 · Light and Faith Press</w:t>
-      </w:r>
-    </w:p>
-    <w:p>
-      <w:pPr>
-        <w:ind w:firstLine="0"/>
-      </w:pPr>
-      <w:r>
-        <w:rPr>
-          <w:b w:val="0"/>
-          <w:i w:val="0"/>
-          <w:color w:val="5A5040"/>
-          <w:sz w:val="18"/>
-        </w:rPr>
-        <w:t>文章网络版：https://ferryzhou.github.io/christian-film-reviews/</w:t>
       </w:r>
     </w:p>
     <w:p>
@@ -11205,21 +11191,7 @@
           <w:b w:val="0"/>
           <w:i w:val="0"/>
         </w:rPr>
-        <w:t>周津，程序员，基督徒，两个孩子的父亲，在所在教会带领 AWANA 儿童事工。业余经营“光影与信仰”网站（见上方网址），一面为齐宏伟、石衡潭、王书亚等作者的影评做路标式索引，一面撰写以基督信仰为眼光的原创影评。本书二十一篇均首发于该站，网络版可免费阅读；指正与回响，欢迎通过站点联系。</w:t>
-      </w:r>
-    </w:p>
-    <w:p>
-      <w:pPr>
-        <w:ind w:firstLine="0"/>
-      </w:pPr>
-      <w:r>
-        <w:rPr>
-          <w:b w:val="0"/>
-          <w:i w:val="0"/>
-          <w:color w:val="9A7320"/>
-          <w:sz w:val="20"/>
-        </w:rPr>
-        <w:t>https://ferryzhou.github.io/christian-film-reviews/</w:t>
+        <w:t>周津，程序员，基督徒，两个孩子的父亲，在所在教会带领 AWANA 儿童事工。业余经营“光影与信仰”网站，一面为齐宏伟、石衡潭、王书亚等作者的影评做路标式索引，一面撰写以基督信仰为眼光的原创影评。本书二十一篇均首发于该站；指正与回响，欢迎通过站点联系。</w:t>
       </w:r>
     </w:p>
     <w:sectPr>

</xml_diff>